<commit_message>
Finalize SQA documents with verified CI reports and corrective actions
</commit_message>
<xml_diff>
--- a/docs/sqa/Auditoria_Calidad_Hotel_Andes.docx
+++ b/docs/sqa/Auditoria_Calidad_Hotel_Andes.docx
@@ -625,6 +625,112 @@
               <w:rPr>
                 <w:sz w:val="18"/>
               </w:rPr>
+              <w:t>A07 Códigos de salida</w:t>
+            </w:r>
+          </w:p>
+        </w:tc>
+        <w:tc>
+          <w:tcPr>
+            <w:tcW w:type="dxa" w:w="5832"/>
+          </w:tcPr>
+          <w:p>
+            <w:pPr>
+              <w:spacing w:after="80" w:before="60" w:line="240" w:lineRule="auto"/>
+            </w:pPr>
+            <w:r>
+              <w:rPr>
+                <w:sz w:val="18"/>
+              </w:rPr>
+              <w:t>La primera CI mostró éxito aunque Cypress y Selenium fallaron. Activar pipefail y validar los reportes JSON.</w:t>
+            </w:r>
+          </w:p>
+        </w:tc>
+        <w:tc>
+          <w:tcPr>
+            <w:tcW w:type="dxa" w:w="2304"/>
+          </w:tcPr>
+          <w:p>
+            <w:pPr>
+              <w:spacing w:after="80" w:before="60" w:line="240" w:lineRule="auto"/>
+            </w:pPr>
+            <w:r>
+              <w:rPr>
+                <w:sz w:val="18"/>
+              </w:rPr>
+              <w:t>Corregido; CI aprobada</w:t>
+            </w:r>
+          </w:p>
+        </w:tc>
+      </w:tr>
+      <w:tr>
+        <w:trPr>
+          <w:cantSplit/>
+        </w:trPr>
+        <w:tc>
+          <w:tcPr>
+            <w:tcW w:type="dxa" w:w="1656"/>
+          </w:tcPr>
+          <w:p>
+            <w:pPr>
+              <w:spacing w:after="80" w:before="60" w:line="240" w:lineRule="auto"/>
+            </w:pPr>
+            <w:r>
+              <w:rPr>
+                <w:sz w:val="18"/>
+              </w:rPr>
+              <w:t>A08 Portabilidad</w:t>
+            </w:r>
+          </w:p>
+        </w:tc>
+        <w:tc>
+          <w:tcPr>
+            <w:tcW w:type="dxa" w:w="5832"/>
+          </w:tcPr>
+          <w:p>
+            <w:pPr>
+              <w:spacing w:after="80" w:before="60" w:line="240" w:lineRule="auto"/>
+            </w:pPr>
+            <w:r>
+              <w:rPr>
+                <w:sz w:val="18"/>
+              </w:rPr>
+              <w:t>En Linux se detectaron problemas en la preparación de sesión y en clics durante el desplazamiento. Corregir preparación y esperas.</w:t>
+            </w:r>
+          </w:p>
+        </w:tc>
+        <w:tc>
+          <w:tcPr>
+            <w:tcW w:type="dxa" w:w="2304"/>
+          </w:tcPr>
+          <w:p>
+            <w:pPr>
+              <w:spacing w:after="80" w:before="60" w:line="240" w:lineRule="auto"/>
+            </w:pPr>
+            <w:r>
+              <w:rPr>
+                <w:sz w:val="18"/>
+              </w:rPr>
+              <w:t>Verificación en ejecución final</w:t>
+            </w:r>
+          </w:p>
+        </w:tc>
+      </w:tr>
+      <w:tr>
+        <w:trPr>
+          <w:cantSplit/>
+        </w:trPr>
+        <w:tc>
+          <w:tcPr>
+            <w:tcW w:type="dxa" w:w="1656"/>
+          </w:tcPr>
+          <w:p>
+            <w:pPr>
+              <w:spacing w:after="80" w:before="60" w:line="240" w:lineRule="auto"/>
+            </w:pPr>
+            <w:r>
+              <w:rPr>
+                <w:sz w:val="18"/>
+              </w:rPr>
               <w:t>A06 Aceptación grupal</w:t>
             </w:r>
           </w:p>
@@ -693,7 +799,12 @@
     </w:p>
     <w:p>
       <w:r>
-        <w:t>A04 se corrigió esperando explícitamente el texto del diálogo e iniciando cada comprobación desde una página recargada. La prueba móvil emula 390 por 844 píxeles; no depende del ancho mínimo de una ventana de escritorio.</w:t>
+        <w:t>A04 se corrigió con espera del texto del diálogo y recarga por caso. A08 añade espera de la consulta inicial de reservas en Cypress, cancelación mediante el flujo visible y desplazamiento instantáneo con comprobación de que el elemento recibe el clic en Selenium. La vista móvil emula 390 por 844 píxeles.</w:t>
+      </w:r>
+    </w:p>
+    <w:p>
+      <w:r>
+        <w:t>A07 detectó que tee ocultaba el fallo de los comandos en CI. El registro 40578393966 mostraba éxito del trabajo, pero sus archivos contenían Cypress 5/6 y Selenium 2/4 aprobados. Se conserva como intento histórico no válido. El flujo corregido utiliza Bash con pipefail y scripts/verify-ci-results.mjs exige Cypress 6/6 y Selenium 4/4 sin omisiones. Estado final comprobado: Aprobada.</w:t>
       </w:r>
     </w:p>
     <w:tbl>
@@ -1130,7 +1241,7 @@
     </w:p>
     <w:p>
       <w:r>
-        <w:t>GitHub Actions: https://github.com/JosuePadillaUnivalle/Hotel-Andes/actions/runs/40578393966</w:t>
+        <w:t>GitHub Actions: https://github.com/JosuePadillaUnivalle/Hotel-Andes/actions/runs/40579881691</w:t>
       </w:r>
     </w:p>
     <w:p>

</xml_diff>

<commit_message>
Document centralized execution and simulated review roles
</commit_message>
<xml_diff>
--- a/docs/sqa/Auditoria_Calidad_Hotel_Andes.docx
+++ b/docs/sqa/Auditoria_Calidad_Hotel_Andes.docx
@@ -211,7 +211,7 @@
               <w:rPr>
                 <w:sz w:val="18"/>
               </w:rPr>
-              <w:t>Plan SQA web y Test Plan SQA HA 1.0</w:t>
+              <w:t>Plan SQA web y Test Plan SQA HA 1.1</w:t>
             </w:r>
           </w:p>
         </w:tc>
@@ -248,7 +248,7 @@
               <w:rPr>
                 <w:sz w:val="18"/>
               </w:rPr>
-              <w:t>Inspección técnica y ejecución de pruebas; validación grupal pendiente</w:t>
+              <w:t>Inspección técnica centralizada y revisión por roles simulados</w:t>
             </w:r>
           </w:p>
         </w:tc>
@@ -269,7 +269,7 @@
     </w:p>
     <w:p>
       <w:r>
-        <w:t>Las pruebas finales locales aprueban las reglas y los recorridos incluidos en el plan. Se incorporaron las dos herramientas de aceptación requeridas, trazabilidad, tablero y CI. El avance es demostrable como proyecto académico. Antes del cierre del sprint, los tres integrantes deben revisar la documentación y el acceso del docente.</w:t>
+        <w:t>Las pruebas finales locales aprueban las reglas y los recorridos incluidos en el plan. Se incorporaron las dos herramientas de aceptación requeridas, trazabilidad, tablero y CI. El avance es demostrable como proyecto académico. El cierre se documenta mediante una revisión por roles simulados centralizada en Josue. El acceso del docente al tablero privado debe comprobarse antes de compartir su enlace.</w:t>
       </w:r>
     </w:p>
     <w:tbl>
@@ -731,7 +731,7 @@
               <w:rPr>
                 <w:sz w:val="18"/>
               </w:rPr>
-              <w:t>A06 Aceptación grupal</w:t>
+              <w:t>A06 Modalidad de revisión</w:t>
             </w:r>
           </w:p>
         </w:tc>
@@ -747,7 +747,7 @@
               <w:rPr>
                 <w:sz w:val="18"/>
               </w:rPr>
-              <w:t>Confirmar roles, revisar resultados e invitar al docente si necesita acceso al tablero privado.</w:t>
+              <w:t>Documentar la ejecución centralizada y el ejercicio de roles de producto, QA y Scrum Master.</w:t>
             </w:r>
           </w:p>
         </w:tc>
@@ -763,7 +763,7 @@
               <w:rPr>
                 <w:sz w:val="18"/>
               </w:rPr>
-              <w:t>Pendiente en QA04</w:t>
+              <w:t>Registrado en QA04 como simulación</w:t>
             </w:r>
           </w:p>
         </w:tc>
@@ -1213,12 +1213,12 @@
     </w:p>
     <w:p>
       <w:r>
-        <w:t>QA04 mantiene pendiente la revisión real del grupo. MEJ01 propone accesibilidad y rendimiento; MEJ02 añade cobertura de código y seguimiento de velocidad. Estas mejoras no se presentan como pruebas ejecutadas. El análisis no certifica seguridad completa ni preparación para huéspedes reales.</w:t>
+        <w:t>QA04 registra la revisión por roles simulados. MEJ01 propone accesibilidad y rendimiento; MEJ02 añade cobertura y velocidad. Estas mejoras no se presentan como pruebas ejecutadas. La simulación no acredita revisión independiente ni participación efectiva de tres revisores. El análisis no certifica seguridad completa ni preparación para huéspedes reales.</w:t>
       </w:r>
     </w:p>
     <w:p>
       <w:r>
-        <w:t>Los responsables de seguimiento se proponen en el plan: Josue para entrega y acceso, Santiago para entorno e integración, y Karen para trazabilidad y métricas. La revisión final debe registrar acuerdos y aceptar o ajustar esa distribución.</w:t>
+        <w:t>En el ejercicio, Josue representa producto y entrega; Santiago representa Scrum Master y revisa como rol la concurrencia y CI; Karen representa QA y revisa como rol fechas, aislamiento, cancelación y métricas. La ejecución está centralizada en Josue. El registro REVISION_ROLES.md enlaza los casos y resultados; no se atribuyen firmas ni aprobaciones personales a Karen o Santiago.</w:t>
       </w:r>
     </w:p>
     <w:p>

</xml_diff>